<commit_message>
Agrega pestaña de costeo de agitadores, variables de plantilla y catalogo de partes
- Nueva pestaña de costeo (costeo.js, costeo_db.js) basada en PLANTILLA DE P. (2)
- Categoria/codigo dinamicos por fila, catalogo administrable, import desde Excel
- Documentacion de variables disponibles para la plantilla de cotizacion
- Limpieza de archivos temporales de Office y .gitignore
</commit_message>
<xml_diff>
--- a/FILES/CA_NNN_26_CLIENTE_AGITADOR_variables.docx
+++ b/FILES/CA_NNN_26_CLIENTE_AGITADOR_variables.docx
@@ -69,7 +69,29 @@
                 <w:sz w:val="28"/>
                 <w:szCs w:val="28"/>
               </w:rPr>
-              <w:t>${cotizacion}</w:t>
+              <w:t>${</w:t>
+            </w:r>
+            <w:proofErr w:type="spellStart"/>
+            <w:r>
+              <w:rPr>
+                <w:rFonts w:ascii="Arial" w:eastAsia="Arial" w:hAnsi="Arial" w:cs="Arial"/>
+                <w:b/>
+                <w:color w:val="000000"/>
+                <w:sz w:val="28"/>
+                <w:szCs w:val="28"/>
+              </w:rPr>
+              <w:t>cotizacion</w:t>
+            </w:r>
+            <w:proofErr w:type="spellEnd"/>
+            <w:r>
+              <w:rPr>
+                <w:rFonts w:ascii="Arial" w:eastAsia="Arial" w:hAnsi="Arial" w:cs="Arial"/>
+                <w:b/>
+                <w:color w:val="000000"/>
+                <w:sz w:val="28"/>
+                <w:szCs w:val="28"/>
+              </w:rPr>
+              <w:t>}</w:t>
             </w:r>
           </w:p>
           <w:p>
@@ -302,7 +324,27 @@
                       <w:sz w:val="20"/>
                       <w:szCs w:val="20"/>
                     </w:rPr>
-                    <w:t>${ciudad_cliente}</w:t>
+                    <w:t>${</w:t>
+                  </w:r>
+                  <w:proofErr w:type="spellStart"/>
+                  <w:r>
+                    <w:rPr>
+                      <w:rFonts w:ascii="Arial" w:eastAsia="Arial" w:hAnsi="Arial" w:cs="Arial"/>
+                      <w:color w:val="000000"/>
+                      <w:sz w:val="20"/>
+                      <w:szCs w:val="20"/>
+                    </w:rPr>
+                    <w:t>ciudad_cliente</w:t>
+                  </w:r>
+                  <w:proofErr w:type="spellEnd"/>
+                  <w:r>
+                    <w:rPr>
+                      <w:rFonts w:ascii="Arial" w:eastAsia="Arial" w:hAnsi="Arial" w:cs="Arial"/>
+                      <w:color w:val="000000"/>
+                      <w:sz w:val="20"/>
+                      <w:szCs w:val="20"/>
+                    </w:rPr>
+                    <w:t>}</w:t>
                   </w:r>
                 </w:p>
               </w:tc>
@@ -389,7 +431,21 @@
                     <w:rPr>
                       <w:rFonts w:ascii="Arial" w:eastAsia="Arial" w:hAnsi="Arial" w:cs="Arial"/>
                     </w:rPr>
-                    <w:t>${contacto_cliente}</w:t>
+                    <w:t>${</w:t>
+                  </w:r>
+                  <w:proofErr w:type="spellStart"/>
+                  <w:r>
+                    <w:rPr>
+                      <w:rFonts w:ascii="Arial" w:eastAsia="Arial" w:hAnsi="Arial" w:cs="Arial"/>
+                    </w:rPr>
+                    <w:t>contacto_cliente</w:t>
+                  </w:r>
+                  <w:proofErr w:type="spellEnd"/>
+                  <w:r>
+                    <w:rPr>
+                      <w:rFonts w:ascii="Arial" w:eastAsia="Arial" w:hAnsi="Arial" w:cs="Arial"/>
+                    </w:rPr>
+                    <w:t>}</w:t>
                   </w:r>
                 </w:p>
               </w:tc>
@@ -602,17 +658,19 @@
                     </w:rPr>
                     <w:t>${</w:t>
                   </w:r>
+                  <w:proofErr w:type="spellStart"/>
                   <w:r>
                     <w:rPr>
                       <w:rFonts w:ascii="Arial" w:eastAsia="Arial" w:hAnsi="Arial" w:cs="Arial"/>
                     </w:rPr>
-                    <w:t>celular</w:t>
+                    <w:t>celular_cliente</w:t>
                   </w:r>
+                  <w:proofErr w:type="spellEnd"/>
                   <w:r>
                     <w:rPr>
                       <w:rFonts w:ascii="Arial" w:eastAsia="Arial" w:hAnsi="Arial" w:cs="Arial"/>
                     </w:rPr>
-                    <w:t>_cliente}</w:t>
+                    <w:t>}</w:t>
                   </w:r>
                 </w:p>
               </w:tc>
@@ -674,6 +732,7 @@
                       <w:szCs w:val="20"/>
                     </w:rPr>
                   </w:pPr>
+                  <w:proofErr w:type="spellStart"/>
                   <w:r>
                     <w:rPr>
                       <w:rFonts w:ascii="Arial" w:eastAsia="Arial" w:hAnsi="Arial" w:cs="Arial"/>
@@ -682,7 +741,18 @@
                       <w:sz w:val="20"/>
                       <w:szCs w:val="20"/>
                     </w:rPr>
-                    <w:t>Ref:</w:t>
+                    <w:t>Ref</w:t>
+                  </w:r>
+                  <w:proofErr w:type="spellEnd"/>
+                  <w:r>
+                    <w:rPr>
+                      <w:rFonts w:ascii="Arial" w:eastAsia="Arial" w:hAnsi="Arial" w:cs="Arial"/>
+                      <w:b/>
+                      <w:color w:val="000000"/>
+                      <w:sz w:val="20"/>
+                      <w:szCs w:val="20"/>
+                    </w:rPr>
+                    <w:t>:</w:t>
                   </w:r>
                 </w:p>
               </w:tc>
@@ -815,7 +885,21 @@
                     <w:rPr>
                       <w:rFonts w:ascii="Arial" w:eastAsia="Arial" w:hAnsi="Arial" w:cs="Arial"/>
                     </w:rPr>
-                    <w:t>${correo_cliente}</w:t>
+                    <w:t>${</w:t>
+                  </w:r>
+                  <w:proofErr w:type="spellStart"/>
+                  <w:r>
+                    <w:rPr>
+                      <w:rFonts w:ascii="Arial" w:eastAsia="Arial" w:hAnsi="Arial" w:cs="Arial"/>
+                    </w:rPr>
+                    <w:t>correo_cliente</w:t>
+                  </w:r>
+                  <w:proofErr w:type="spellEnd"/>
+                  <w:r>
+                    <w:rPr>
+                      <w:rFonts w:ascii="Arial" w:eastAsia="Arial" w:hAnsi="Arial" w:cs="Arial"/>
+                    </w:rPr>
+                    <w:t>}</w:t>
                   </w:r>
                 </w:p>
               </w:tc>
@@ -1128,7 +1212,21 @@
         <w:rPr>
           <w:rFonts w:ascii="Arial" w:eastAsia="Arial" w:hAnsi="Arial" w:cs="Arial"/>
         </w:rPr>
-        <w:t>${cotizacion}</w:t>
+        <w:t>${</w:t>
+      </w:r>
+      <w:proofErr w:type="spellStart"/>
+      <w:r>
+        <w:rPr>
+          <w:rFonts w:ascii="Arial" w:eastAsia="Arial" w:hAnsi="Arial" w:cs="Arial"/>
+        </w:rPr>
+        <w:t>cotizacion</w:t>
+      </w:r>
+      <w:proofErr w:type="spellEnd"/>
+      <w:r>
+        <w:rPr>
+          <w:rFonts w:ascii="Arial" w:eastAsia="Arial" w:hAnsi="Arial" w:cs="Arial"/>
+        </w:rPr>
+        <w:t>}</w:t>
       </w:r>
       <w:r>
         <w:rPr>
@@ -1315,6 +1413,13 @@
           <w:color w:val="000000"/>
         </w:rPr>
       </w:pPr>
+      <w:r>
+        <w:rPr>
+          <w:rFonts w:ascii="Arial" w:eastAsia="Arial" w:hAnsi="Arial" w:cs="Arial"/>
+          <w:color w:val="000000"/>
+        </w:rPr>
+        <w:t xml:space="preserve">${comentarios} </w:t>
+      </w:r>
     </w:p>
     <w:p>
       <w:pPr>
@@ -1888,7 +1993,21 @@
         <w:rPr>
           <w:rFonts w:ascii="Arial" w:eastAsia="Arial" w:hAnsi="Arial" w:cs="Arial"/>
         </w:rPr>
-        <w:t>Los agitadores se suministran con placa de identificación en inox 304.</w:t>
+        <w:t xml:space="preserve">Los agitadores se suministran con placa de identificación en </w:t>
+      </w:r>
+      <w:proofErr w:type="spellStart"/>
+      <w:r>
+        <w:rPr>
+          <w:rFonts w:ascii="Arial" w:eastAsia="Arial" w:hAnsi="Arial" w:cs="Arial"/>
+        </w:rPr>
+        <w:t>inox</w:t>
+      </w:r>
+      <w:proofErr w:type="spellEnd"/>
+      <w:r>
+        <w:rPr>
+          <w:rFonts w:ascii="Arial" w:eastAsia="Arial" w:hAnsi="Arial" w:cs="Arial"/>
+        </w:rPr>
+        <w:t xml:space="preserve"> 304.</w:t>
       </w:r>
     </w:p>
     <w:p>
@@ -2345,7 +2464,21 @@
         <w:rPr>
           <w:w w:val="90"/>
         </w:rPr>
-        <w:t xml:space="preserve">${diametro} </w:t>
+        <w:t>${</w:t>
+      </w:r>
+      <w:proofErr w:type="spellStart"/>
+      <w:r>
+        <w:rPr>
+          <w:w w:val="90"/>
+        </w:rPr>
+        <w:t>diametro</w:t>
+      </w:r>
+      <w:proofErr w:type="spellEnd"/>
+      <w:r>
+        <w:rPr>
+          <w:w w:val="90"/>
+        </w:rPr>
+        <w:t xml:space="preserve">} </w:t>
       </w:r>
       <w:r>
         <w:rPr>
@@ -2382,7 +2515,21 @@
         <w:rPr>
           <w:w w:val="85"/>
         </w:rPr>
-        <w:t xml:space="preserve">${altura_total} </w:t>
+        <w:t>${</w:t>
+      </w:r>
+      <w:proofErr w:type="spellStart"/>
+      <w:r>
+        <w:rPr>
+          <w:w w:val="85"/>
+        </w:rPr>
+        <w:t>altura_total</w:t>
+      </w:r>
+      <w:proofErr w:type="spellEnd"/>
+      <w:r>
+        <w:rPr>
+          <w:w w:val="85"/>
+        </w:rPr>
+        <w:t xml:space="preserve">} </w:t>
       </w:r>
       <w:r>
         <w:rPr>
@@ -2438,7 +2585,21 @@
         <w:rPr>
           <w:w w:val="80"/>
         </w:rPr>
-        <w:t xml:space="preserve">${altura_util} </w:t>
+        <w:t>${</w:t>
+      </w:r>
+      <w:proofErr w:type="spellStart"/>
+      <w:r>
+        <w:rPr>
+          <w:w w:val="80"/>
+        </w:rPr>
+        <w:t>altura_util</w:t>
+      </w:r>
+      <w:proofErr w:type="spellEnd"/>
+      <w:r>
+        <w:rPr>
+          <w:w w:val="80"/>
+        </w:rPr>
+        <w:t xml:space="preserve">} </w:t>
       </w:r>
       <w:r>
         <w:rPr>
@@ -2460,25 +2621,33 @@
         <w:rPr>
           <w:w w:val="85"/>
         </w:rPr>
-        <w:t xml:space="preserve">Volumen útil </w:t>
+        <w:t>Volumen útil (calculado):</w:t>
       </w:r>
       <w:r>
         <w:rPr>
           <w:w w:val="85"/>
         </w:rPr>
-        <w:t>(calculado):</w:t>
+        <w:tab/>
       </w:r>
       <w:r>
         <w:rPr>
           <w:w w:val="85"/>
         </w:rPr>
-        <w:tab/>
-      </w:r>
+        <w:t>${</w:t>
+      </w:r>
+      <w:proofErr w:type="spellStart"/>
       <w:r>
         <w:rPr>
           <w:w w:val="85"/>
         </w:rPr>
-        <w:t xml:space="preserve">${volumen_util} </w:t>
+        <w:t>volumen_util</w:t>
+      </w:r>
+      <w:proofErr w:type="spellEnd"/>
+      <w:r>
+        <w:rPr>
+          <w:w w:val="85"/>
+        </w:rPr>
+        <w:t xml:space="preserve">} </w:t>
       </w:r>
       <w:r>
         <w:rPr>
@@ -2705,6 +2874,7 @@
                 <w:szCs w:val="16"/>
               </w:rPr>
             </w:pPr>
+            <w:proofErr w:type="spellStart"/>
             <w:r>
               <w:rPr>
                 <w:rFonts w:ascii="Arial" w:eastAsia="Arial" w:hAnsi="Arial" w:cs="Arial"/>
@@ -2713,6 +2883,7 @@
               </w:rPr>
               <w:t>Item</w:t>
             </w:r>
+            <w:proofErr w:type="spellEnd"/>
           </w:p>
         </w:tc>
         <w:tc>
@@ -3093,7 +3264,27 @@
                 <w:sz w:val="16"/>
                 <w:szCs w:val="16"/>
               </w:rPr>
-              <w:t>${codigo_agitador}</w:t>
+              <w:t>${</w:t>
+            </w:r>
+            <w:proofErr w:type="spellStart"/>
+            <w:r>
+              <w:rPr>
+                <w:rFonts w:ascii="Arial" w:eastAsia="Arial" w:hAnsi="Arial" w:cs="Arial"/>
+                <w:color w:val="000000"/>
+                <w:sz w:val="16"/>
+                <w:szCs w:val="16"/>
+              </w:rPr>
+              <w:t>codigo_agitador</w:t>
+            </w:r>
+            <w:proofErr w:type="spellEnd"/>
+            <w:r>
+              <w:rPr>
+                <w:rFonts w:ascii="Arial" w:eastAsia="Arial" w:hAnsi="Arial" w:cs="Arial"/>
+                <w:color w:val="000000"/>
+                <w:sz w:val="16"/>
+                <w:szCs w:val="16"/>
+              </w:rPr>
+              <w:t>}</w:t>
             </w:r>
           </w:p>
           <w:p>
@@ -3175,7 +3366,27 @@
                 <w:sz w:val="16"/>
                 <w:szCs w:val="16"/>
               </w:rPr>
-              <w:t xml:space="preserve">Longitud del eje (H) aprox: </w:t>
+              <w:t xml:space="preserve">Longitud del eje (H) </w:t>
+            </w:r>
+            <w:proofErr w:type="spellStart"/>
+            <w:r>
+              <w:rPr>
+                <w:rFonts w:ascii="Arial" w:eastAsia="Arial" w:hAnsi="Arial" w:cs="Arial"/>
+                <w:color w:val="000000"/>
+                <w:sz w:val="16"/>
+                <w:szCs w:val="16"/>
+              </w:rPr>
+              <w:t>aprox</w:t>
+            </w:r>
+            <w:proofErr w:type="spellEnd"/>
+            <w:r>
+              <w:rPr>
+                <w:rFonts w:ascii="Arial" w:eastAsia="Arial" w:hAnsi="Arial" w:cs="Arial"/>
+                <w:color w:val="000000"/>
+                <w:sz w:val="16"/>
+                <w:szCs w:val="16"/>
+              </w:rPr>
+              <w:t xml:space="preserve">: </w:t>
             </w:r>
             <w:r>
               <w:rPr>
@@ -3271,25 +3482,16 @@
                 <w:sz w:val="16"/>
                 <w:szCs w:val="16"/>
               </w:rPr>
-              <w:t>8</w:t>
-            </w:r>
-            <w:r>
-              <w:rPr>
-                <w:rFonts w:ascii="Arial" w:eastAsia="Arial" w:hAnsi="Arial" w:cs="Arial"/>
-                <w:color w:val="000000"/>
-                <w:sz w:val="16"/>
-                <w:szCs w:val="16"/>
-              </w:rPr>
-              <w:t>0</w:t>
-            </w:r>
-            <w:r>
-              <w:rPr>
-                <w:rFonts w:ascii="Arial" w:eastAsia="Arial" w:hAnsi="Arial" w:cs="Arial"/>
-                <w:color w:val="000000"/>
-                <w:sz w:val="16"/>
-                <w:szCs w:val="16"/>
-              </w:rPr>
-              <w:t xml:space="preserve"> RPM +- 10%  </w:t>
+              <w:t xml:space="preserve">${rpm} </w:t>
+            </w:r>
+            <w:r>
+              <w:rPr>
+                <w:rFonts w:ascii="Arial" w:eastAsia="Arial" w:hAnsi="Arial" w:cs="Arial"/>
+                <w:color w:val="000000"/>
+                <w:sz w:val="16"/>
+                <w:szCs w:val="16"/>
+              </w:rPr>
+              <w:t xml:space="preserve">+- 10%  </w:t>
             </w:r>
           </w:p>
           <w:p>
@@ -3310,7 +3512,27 @@
                 <w:sz w:val="16"/>
                 <w:szCs w:val="16"/>
               </w:rPr>
-              <w:t>Material de eje: ${cod_material}</w:t>
+              <w:t>Material de eje: ${</w:t>
+            </w:r>
+            <w:proofErr w:type="spellStart"/>
+            <w:r>
+              <w:rPr>
+                <w:rFonts w:ascii="Arial" w:eastAsia="Arial" w:hAnsi="Arial" w:cs="Arial"/>
+                <w:color w:val="000000"/>
+                <w:sz w:val="16"/>
+                <w:szCs w:val="16"/>
+              </w:rPr>
+              <w:t>cod_material</w:t>
+            </w:r>
+            <w:proofErr w:type="spellEnd"/>
+            <w:r>
+              <w:rPr>
+                <w:rFonts w:ascii="Arial" w:eastAsia="Arial" w:hAnsi="Arial" w:cs="Arial"/>
+                <w:color w:val="000000"/>
+                <w:sz w:val="16"/>
+                <w:szCs w:val="16"/>
+              </w:rPr>
+              <w:t>}</w:t>
             </w:r>
           </w:p>
           <w:p>
@@ -3331,7 +3553,27 @@
                 <w:sz w:val="16"/>
                 <w:szCs w:val="16"/>
               </w:rPr>
-              <w:t>Material de propela: ${cod_material}</w:t>
+              <w:t>Material de propela: ${</w:t>
+            </w:r>
+            <w:proofErr w:type="spellStart"/>
+            <w:r>
+              <w:rPr>
+                <w:rFonts w:ascii="Arial" w:eastAsia="Arial" w:hAnsi="Arial" w:cs="Arial"/>
+                <w:color w:val="000000"/>
+                <w:sz w:val="16"/>
+                <w:szCs w:val="16"/>
+              </w:rPr>
+              <w:t>cod_material</w:t>
+            </w:r>
+            <w:proofErr w:type="spellEnd"/>
+            <w:r>
+              <w:rPr>
+                <w:rFonts w:ascii="Arial" w:eastAsia="Arial" w:hAnsi="Arial" w:cs="Arial"/>
+                <w:color w:val="000000"/>
+                <w:sz w:val="16"/>
+                <w:szCs w:val="16"/>
+              </w:rPr>
+              <w:t>}</w:t>
             </w:r>
           </w:p>
           <w:p>
@@ -3352,7 +3594,27 @@
                 <w:sz w:val="16"/>
                 <w:szCs w:val="16"/>
               </w:rPr>
-              <w:t>Acabado: ${cod_adicional}</w:t>
+              <w:t>Acabado: ${</w:t>
+            </w:r>
+            <w:proofErr w:type="spellStart"/>
+            <w:r>
+              <w:rPr>
+                <w:rFonts w:ascii="Arial" w:eastAsia="Arial" w:hAnsi="Arial" w:cs="Arial"/>
+                <w:color w:val="000000"/>
+                <w:sz w:val="16"/>
+                <w:szCs w:val="16"/>
+              </w:rPr>
+              <w:t>cod_adicional</w:t>
+            </w:r>
+            <w:proofErr w:type="spellEnd"/>
+            <w:r>
+              <w:rPr>
+                <w:rFonts w:ascii="Arial" w:eastAsia="Arial" w:hAnsi="Arial" w:cs="Arial"/>
+                <w:color w:val="000000"/>
+                <w:sz w:val="16"/>
+                <w:szCs w:val="16"/>
+              </w:rPr>
+              <w:t>}</w:t>
             </w:r>
           </w:p>
           <w:p>
@@ -3373,7 +3635,27 @@
                 <w:sz w:val="16"/>
                 <w:szCs w:val="16"/>
               </w:rPr>
-              <w:t>Tipo de motor: ${cod_motor}</w:t>
+              <w:t>Tipo de motor: ${</w:t>
+            </w:r>
+            <w:proofErr w:type="spellStart"/>
+            <w:r>
+              <w:rPr>
+                <w:rFonts w:ascii="Arial" w:eastAsia="Arial" w:hAnsi="Arial" w:cs="Arial"/>
+                <w:color w:val="000000"/>
+                <w:sz w:val="16"/>
+                <w:szCs w:val="16"/>
+              </w:rPr>
+              <w:t>cod_motor</w:t>
+            </w:r>
+            <w:proofErr w:type="spellEnd"/>
+            <w:r>
+              <w:rPr>
+                <w:rFonts w:ascii="Arial" w:eastAsia="Arial" w:hAnsi="Arial" w:cs="Arial"/>
+                <w:color w:val="000000"/>
+                <w:sz w:val="16"/>
+                <w:szCs w:val="16"/>
+              </w:rPr>
+              <w:t>}</w:t>
             </w:r>
           </w:p>
           <w:p>
@@ -3394,16 +3676,54 @@
                 <w:sz w:val="16"/>
                 <w:szCs w:val="16"/>
               </w:rPr>
-              <w:t>Velocidad de motor: ${rpm} RPM</w:t>
-            </w:r>
-            <w:r>
-              <w:rPr>
-                <w:rFonts w:ascii="Arial" w:eastAsia="Arial" w:hAnsi="Arial" w:cs="Arial"/>
-                <w:color w:val="000000"/>
-                <w:sz w:val="16"/>
-                <w:szCs w:val="16"/>
-              </w:rPr>
-              <w:t xml:space="preserve"> (max)</w:t>
+              <w:t>Velocidad de motor:</w:t>
+            </w:r>
+            <w:r>
+              <w:rPr>
+                <w:rFonts w:ascii="Arial" w:eastAsia="Arial" w:hAnsi="Arial" w:cs="Arial"/>
+                <w:color w:val="000000"/>
+                <w:sz w:val="16"/>
+                <w:szCs w:val="16"/>
+              </w:rPr>
+              <w:t xml:space="preserve"> 1750</w:t>
+            </w:r>
+            <w:r>
+              <w:rPr>
+                <w:rFonts w:ascii="Arial" w:eastAsia="Arial" w:hAnsi="Arial" w:cs="Arial"/>
+                <w:color w:val="000000"/>
+                <w:sz w:val="16"/>
+                <w:szCs w:val="16"/>
+              </w:rPr>
+              <w:t xml:space="preserve"> RPM</w:t>
+            </w:r>
+            <w:r>
+              <w:rPr>
+                <w:rFonts w:ascii="Arial" w:eastAsia="Arial" w:hAnsi="Arial" w:cs="Arial"/>
+                <w:color w:val="000000"/>
+                <w:sz w:val="16"/>
+                <w:szCs w:val="16"/>
+              </w:rPr>
+              <w:t xml:space="preserve"> (</w:t>
+            </w:r>
+            <w:proofErr w:type="spellStart"/>
+            <w:r>
+              <w:rPr>
+                <w:rFonts w:ascii="Arial" w:eastAsia="Arial" w:hAnsi="Arial" w:cs="Arial"/>
+                <w:color w:val="000000"/>
+                <w:sz w:val="16"/>
+                <w:szCs w:val="16"/>
+              </w:rPr>
+              <w:t>max</w:t>
+            </w:r>
+            <w:proofErr w:type="spellEnd"/>
+            <w:r>
+              <w:rPr>
+                <w:rFonts w:ascii="Arial" w:eastAsia="Arial" w:hAnsi="Arial" w:cs="Arial"/>
+                <w:color w:val="000000"/>
+                <w:sz w:val="16"/>
+                <w:szCs w:val="16"/>
+              </w:rPr>
+              <w:t>)</w:t>
             </w:r>
           </w:p>
           <w:p>
@@ -3433,7 +3753,27 @@
                 <w:sz w:val="16"/>
                 <w:szCs w:val="16"/>
               </w:rPr>
-              <w:t>${motor_cercano}</w:t>
+              <w:t>${</w:t>
+            </w:r>
+            <w:proofErr w:type="spellStart"/>
+            <w:r>
+              <w:rPr>
+                <w:rFonts w:ascii="Arial" w:eastAsia="Arial" w:hAnsi="Arial" w:cs="Arial"/>
+                <w:color w:val="000000"/>
+                <w:sz w:val="16"/>
+                <w:szCs w:val="16"/>
+              </w:rPr>
+              <w:t>motor_cercano</w:t>
+            </w:r>
+            <w:proofErr w:type="spellEnd"/>
+            <w:r>
+              <w:rPr>
+                <w:rFonts w:ascii="Arial" w:eastAsia="Arial" w:hAnsi="Arial" w:cs="Arial"/>
+                <w:color w:val="000000"/>
+                <w:sz w:val="16"/>
+                <w:szCs w:val="16"/>
+              </w:rPr>
+              <w:t>}</w:t>
             </w:r>
           </w:p>
           <w:p>
@@ -3550,7 +3890,27 @@
                 <w:sz w:val="16"/>
                 <w:szCs w:val="16"/>
               </w:rPr>
-              <w:t>${nivel_agitacion}</w:t>
+              <w:t>${</w:t>
+            </w:r>
+            <w:proofErr w:type="spellStart"/>
+            <w:r>
+              <w:rPr>
+                <w:rFonts w:ascii="Arial" w:eastAsia="Arial" w:hAnsi="Arial" w:cs="Arial"/>
+                <w:color w:val="000000"/>
+                <w:sz w:val="16"/>
+                <w:szCs w:val="16"/>
+              </w:rPr>
+              <w:t>nivel_agitacion</w:t>
+            </w:r>
+            <w:proofErr w:type="spellEnd"/>
+            <w:r>
+              <w:rPr>
+                <w:rFonts w:ascii="Arial" w:eastAsia="Arial" w:hAnsi="Arial" w:cs="Arial"/>
+                <w:color w:val="000000"/>
+                <w:sz w:val="16"/>
+                <w:szCs w:val="16"/>
+              </w:rPr>
+              <w:t>}</w:t>
             </w:r>
             <w:r>
               <w:rPr>
@@ -4348,14 +4708,30 @@
           <w:rFonts w:ascii="Arial" w:eastAsia="Arial" w:hAnsi="Arial" w:cs="Arial"/>
           <w:color w:val="000000"/>
         </w:rPr>
-        <w:t>contra pruebas en planta de Novatec</w:t>
-      </w:r>
-      <w:r>
-        <w:rPr>
-          <w:rFonts w:ascii="Arial" w:eastAsia="Arial" w:hAnsi="Arial" w:cs="Arial"/>
-          <w:color w:val="000000"/>
-        </w:rPr>
-        <w:t>FS y</w:t>
+        <w:t xml:space="preserve">contra pruebas en planta de </w:t>
+      </w:r>
+      <w:proofErr w:type="spellStart"/>
+      <w:r>
+        <w:rPr>
+          <w:rFonts w:ascii="Arial" w:eastAsia="Arial" w:hAnsi="Arial" w:cs="Arial"/>
+          <w:color w:val="000000"/>
+        </w:rPr>
+        <w:t>Novatec</w:t>
+      </w:r>
+      <w:r>
+        <w:rPr>
+          <w:rFonts w:ascii="Arial" w:eastAsia="Arial" w:hAnsi="Arial" w:cs="Arial"/>
+          <w:color w:val="000000"/>
+        </w:rPr>
+        <w:t>FS</w:t>
+      </w:r>
+      <w:proofErr w:type="spellEnd"/>
+      <w:r>
+        <w:rPr>
+          <w:rFonts w:ascii="Arial" w:eastAsia="Arial" w:hAnsi="Arial" w:cs="Arial"/>
+          <w:color w:val="000000"/>
+        </w:rPr>
+        <w:t xml:space="preserve"> y</w:t>
       </w:r>
       <w:r>
         <w:rPr>
@@ -4471,7 +4847,23 @@
           <w:rFonts w:ascii="Arial" w:eastAsia="Arial" w:hAnsi="Arial" w:cs="Arial"/>
           <w:color w:val="000000"/>
         </w:rPr>
-        <w:t>${moneda_oferta}</w:t>
+        <w:t>${</w:t>
+      </w:r>
+      <w:proofErr w:type="spellStart"/>
+      <w:r>
+        <w:rPr>
+          <w:rFonts w:ascii="Arial" w:eastAsia="Arial" w:hAnsi="Arial" w:cs="Arial"/>
+          <w:color w:val="000000"/>
+        </w:rPr>
+        <w:t>moneda_oferta</w:t>
+      </w:r>
+      <w:proofErr w:type="spellEnd"/>
+      <w:r>
+        <w:rPr>
+          <w:rFonts w:ascii="Arial" w:eastAsia="Arial" w:hAnsi="Arial" w:cs="Arial"/>
+          <w:color w:val="000000"/>
+        </w:rPr>
+        <w:t>}</w:t>
       </w:r>
       <w:r>
         <w:rPr>
@@ -4507,7 +4899,23 @@
           <w:rFonts w:ascii="Arial" w:eastAsia="Arial" w:hAnsi="Arial" w:cs="Arial"/>
           <w:color w:val="000000"/>
         </w:rPr>
-        <w:t xml:space="preserve">      ${sitio_entrega}</w:t>
+        <w:t xml:space="preserve">      ${</w:t>
+      </w:r>
+      <w:proofErr w:type="spellStart"/>
+      <w:r>
+        <w:rPr>
+          <w:rFonts w:ascii="Arial" w:eastAsia="Arial" w:hAnsi="Arial" w:cs="Arial"/>
+          <w:color w:val="000000"/>
+        </w:rPr>
+        <w:t>sitio_entrega</w:t>
+      </w:r>
+      <w:proofErr w:type="spellEnd"/>
+      <w:r>
+        <w:rPr>
+          <w:rFonts w:ascii="Arial" w:eastAsia="Arial" w:hAnsi="Arial" w:cs="Arial"/>
+          <w:color w:val="000000"/>
+        </w:rPr>
+        <w:t>}</w:t>
       </w:r>
     </w:p>
     <w:p>
@@ -4676,7 +5084,15 @@
           <w:rFonts w:ascii="Arial" w:eastAsia="Arial" w:hAnsi="Arial" w:cs="Arial"/>
           <w:color w:val="000000"/>
         </w:rPr>
-        <w:t>agitación (Si Novatec</w:t>
+        <w:t xml:space="preserve">agitación (Si </w:t>
+      </w:r>
+      <w:proofErr w:type="spellStart"/>
+      <w:r>
+        <w:rPr>
+          <w:rFonts w:ascii="Arial" w:eastAsia="Arial" w:hAnsi="Arial" w:cs="Arial"/>
+          <w:color w:val="000000"/>
+        </w:rPr>
+        <w:t>Novatec</w:t>
       </w:r>
       <w:r>
         <w:rPr>
@@ -4685,6 +5101,7 @@
         </w:rPr>
         <w:t>FS</w:t>
       </w:r>
+      <w:proofErr w:type="spellEnd"/>
       <w:r>
         <w:rPr>
           <w:rFonts w:ascii="Arial" w:eastAsia="Arial" w:hAnsi="Arial" w:cs="Arial"/>
@@ -7854,28 +8271,28 @@
 </file>
 
 <file path=customXml/item1.xml><?xml version="1.0" encoding="utf-8"?>
+<b:Sources xmlns:b="http://schemas.openxmlformats.org/officeDocument/2006/bibliography" xmlns="http://schemas.openxmlformats.org/officeDocument/2006/bibliography" SelectedStyle="\APASixthEditionOfficeOnline.xsl" StyleName="APA" Version="6"/>
+</file>
+
+<file path=customXml/item2.xml><?xml version="1.0" encoding="utf-8"?>
 <go:gDocsCustomXmlDataStorage xmlns:go="http://customooxmlschemas.google.com/" xmlns:r="http://schemas.openxmlformats.org/officeDocument/2006/relationships" uri="GoogleDocsCustomDataVersion2">
   <go:docsCustomData xmlns:go="http://customooxmlschemas.google.com/" roundtripDataSignature="AMtx7mg4m6OksPkJm72OfEbwcFayAF9DJg==">CgMxLjA4AHIhMUZkelFZUGE1bDl1N2xBOVN4M1Y2bmxkNlRWTHp1dmZs</go:docsCustomData>
 </go:gDocsCustomXmlDataStorage>
 </file>
 
-<file path=customXml/item2.xml><?xml version="1.0" encoding="utf-8"?>
-<b:Sources xmlns:b="http://schemas.openxmlformats.org/officeDocument/2006/bibliography" xmlns="http://schemas.openxmlformats.org/officeDocument/2006/bibliography" SelectedStyle="\APASixthEditionOfficeOnline.xsl" StyleName="APA" Version="6"/>
+<file path=customXml/itemProps1.xml><?xml version="1.0" encoding="utf-8"?>
+<ds:datastoreItem xmlns:ds="http://schemas.openxmlformats.org/officeDocument/2006/customXml" ds:itemID="{BA633AC6-EFDA-46EC-8101-7EFCAD63717B}">
+  <ds:schemaRefs>
+    <ds:schemaRef ds:uri="http://schemas.openxmlformats.org/officeDocument/2006/bibliography"/>
+  </ds:schemaRefs>
+</ds:datastoreItem>
 </file>
 
-<file path=customXml/itemProps1.xml><?xml version="1.0" encoding="utf-8"?>
+<file path=customXml/itemProps2.xml><?xml version="1.0" encoding="utf-8"?>
 <ds:datastoreItem xmlns:ds="http://schemas.openxmlformats.org/officeDocument/2006/customXml" ds:itemID="{11111111-1234-1234-1234-123412341234}">
   <ds:schemaRefs>
     <ds:schemaRef ds:uri="http://customooxmlschemas.google.com/"/>
     <ds:schemaRef ds:uri="http://schemas.openxmlformats.org/officeDocument/2006/relationships"/>
   </ds:schemaRefs>
 </ds:datastoreItem>
-</file>
-
-<file path=customXml/itemProps2.xml><?xml version="1.0" encoding="utf-8"?>
-<ds:datastoreItem xmlns:ds="http://schemas.openxmlformats.org/officeDocument/2006/customXml" ds:itemID="{BA633AC6-EFDA-46EC-8101-7EFCAD63717B}">
-  <ds:schemaRefs>
-    <ds:schemaRef ds:uri="http://schemas.openxmlformats.org/officeDocument/2006/bibliography"/>
-  </ds:schemaRefs>
-</ds:datastoreItem>
 </file>
</xml_diff>

<commit_message>
Actualizar datos temporales y bases de datos
</commit_message>
<xml_diff>
--- a/FILES/CA_NNN_26_CLIENTE_AGITADOR_variables.docx
+++ b/FILES/CA_NNN_26_CLIENTE_AGITADOR_variables.docx
@@ -1418,7 +1418,115 @@
           <w:rFonts w:ascii="Arial" w:eastAsia="Arial" w:hAnsi="Arial" w:cs="Arial"/>
           <w:color w:val="000000"/>
         </w:rPr>
-        <w:t xml:space="preserve">${comentarios} </w:t>
+        <w:t>${</w:t>
+      </w:r>
+      <w:r>
+        <w:rPr>
+          <w:rFonts w:ascii="Arial" w:eastAsia="Arial" w:hAnsi="Arial" w:cs="Arial"/>
+          <w:color w:val="000000"/>
+        </w:rPr>
+        <w:t>consideracion1</w:t>
+      </w:r>
+      <w:r>
+        <w:rPr>
+          <w:rFonts w:ascii="Arial" w:eastAsia="Arial" w:hAnsi="Arial" w:cs="Arial"/>
+          <w:color w:val="000000"/>
+        </w:rPr>
+        <w:t>}</w:t>
+      </w:r>
+    </w:p>
+    <w:p>
+      <w:pPr>
+        <w:widowControl w:val="0"/>
+        <w:tabs>
+          <w:tab w:val="left" w:pos="142"/>
+        </w:tabs>
+        <w:spacing w:after="0" w:line="240" w:lineRule="auto"/>
+        <w:rPr>
+          <w:rFonts w:ascii="Arial" w:eastAsia="Arial" w:hAnsi="Arial" w:cs="Arial"/>
+          <w:color w:val="000000"/>
+        </w:rPr>
+      </w:pPr>
+      <w:r>
+        <w:rPr>
+          <w:rFonts w:ascii="Arial" w:eastAsia="Arial" w:hAnsi="Arial" w:cs="Arial"/>
+          <w:color w:val="000000"/>
+        </w:rPr>
+        <w:t>${consideracion2}</w:t>
+      </w:r>
+    </w:p>
+    <w:p>
+      <w:pPr>
+        <w:widowControl w:val="0"/>
+        <w:tabs>
+          <w:tab w:val="left" w:pos="142"/>
+        </w:tabs>
+        <w:spacing w:after="0" w:line="240" w:lineRule="auto"/>
+        <w:rPr>
+          <w:rFonts w:ascii="Arial" w:eastAsia="Arial" w:hAnsi="Arial" w:cs="Arial"/>
+          <w:color w:val="000000"/>
+        </w:rPr>
+      </w:pPr>
+      <w:r>
+        <w:rPr>
+          <w:rFonts w:ascii="Arial" w:eastAsia="Arial" w:hAnsi="Arial" w:cs="Arial"/>
+          <w:color w:val="000000"/>
+        </w:rPr>
+        <w:t>${consideracion3}</w:t>
+      </w:r>
+    </w:p>
+    <w:p>
+      <w:pPr>
+        <w:widowControl w:val="0"/>
+        <w:tabs>
+          <w:tab w:val="left" w:pos="142"/>
+        </w:tabs>
+        <w:spacing w:after="0" w:line="240" w:lineRule="auto"/>
+        <w:rPr>
+          <w:rFonts w:ascii="Arial" w:eastAsia="Arial" w:hAnsi="Arial" w:cs="Arial"/>
+          <w:color w:val="000000"/>
+        </w:rPr>
+      </w:pPr>
+      <w:r>
+        <w:rPr>
+          <w:rFonts w:ascii="Arial" w:eastAsia="Arial" w:hAnsi="Arial" w:cs="Arial"/>
+          <w:color w:val="000000"/>
+        </w:rPr>
+        <w:t>${consideracion</w:t>
+      </w:r>
+      <w:r>
+        <w:rPr>
+          <w:rFonts w:ascii="Arial" w:eastAsia="Arial" w:hAnsi="Arial" w:cs="Arial"/>
+          <w:color w:val="000000"/>
+        </w:rPr>
+        <w:t>4</w:t>
+      </w:r>
+      <w:r>
+        <w:rPr>
+          <w:rFonts w:ascii="Arial" w:eastAsia="Arial" w:hAnsi="Arial" w:cs="Arial"/>
+          <w:color w:val="000000"/>
+        </w:rPr>
+        <w:t xml:space="preserve">} </w:t>
+      </w:r>
+    </w:p>
+    <w:p>
+      <w:pPr>
+        <w:widowControl w:val="0"/>
+        <w:tabs>
+          <w:tab w:val="left" w:pos="142"/>
+        </w:tabs>
+        <w:spacing w:after="0" w:line="240" w:lineRule="auto"/>
+        <w:rPr>
+          <w:rFonts w:ascii="Arial" w:eastAsia="Arial" w:hAnsi="Arial" w:cs="Arial"/>
+          <w:color w:val="000000"/>
+        </w:rPr>
+      </w:pPr>
+      <w:r>
+        <w:rPr>
+          <w:rFonts w:ascii="Arial" w:eastAsia="Arial" w:hAnsi="Arial" w:cs="Arial"/>
+          <w:color w:val="000000"/>
+        </w:rPr>
+        <w:t xml:space="preserve"> </w:t>
       </w:r>
     </w:p>
     <w:p>
@@ -1491,6 +1599,23 @@
     </w:p>
     <w:p>
       <w:pPr>
+        <w:pBdr>
+          <w:top w:val="nil"/>
+          <w:left w:val="nil"/>
+          <w:bottom w:val="nil"/>
+          <w:right w:val="nil"/>
+          <w:between w:val="nil"/>
+        </w:pBdr>
+        <w:spacing w:after="0" w:line="240" w:lineRule="auto"/>
+        <w:jc w:val="both"/>
+        <w:rPr>
+          <w:rFonts w:ascii="Arial" w:eastAsia="Arial" w:hAnsi="Arial" w:cs="Arial"/>
+          <w:color w:val="000000"/>
+        </w:rPr>
+      </w:pPr>
+    </w:p>
+    <w:p>
+      <w:pPr>
         <w:numPr>
           <w:ilvl w:val="0"/>
           <w:numId w:val="5"/>
@@ -1514,28 +1639,21 @@
           <w:rFonts w:ascii="Arial" w:eastAsia="Arial" w:hAnsi="Arial" w:cs="Arial"/>
           <w:color w:val="000000"/>
         </w:rPr>
-        <w:t xml:space="preserve">Los agitadores </w:t>
-      </w:r>
-      <w:r>
-        <w:rPr>
-          <w:rFonts w:ascii="Arial" w:eastAsia="Arial" w:hAnsi="Arial" w:cs="Arial"/>
-          <w:color w:val="000000"/>
-        </w:rPr>
-        <w:t>que se presentan en esta propuesta son de la línea estándar de</w:t>
-      </w:r>
-      <w:r>
-        <w:rPr>
-          <w:rFonts w:ascii="Arial" w:eastAsia="Arial" w:hAnsi="Arial" w:cs="Arial"/>
-          <w:color w:val="000000"/>
-        </w:rPr>
-        <w:t xml:space="preserve"> Novatec Fluid System.</w:t>
-      </w:r>
-      <w:r>
-        <w:rPr>
-          <w:rFonts w:ascii="Arial" w:eastAsia="Arial" w:hAnsi="Arial" w:cs="Arial"/>
-          <w:color w:val="000000"/>
-        </w:rPr>
-        <w:t xml:space="preserve"> </w:t>
+        <w:t xml:space="preserve">Los agitadores seleccionados por Novatec Fluid System, </w:t>
+      </w:r>
+      <w:r>
+        <w:rPr>
+          <w:rFonts w:ascii="Arial" w:eastAsia="Arial" w:hAnsi="Arial" w:cs="Arial"/>
+          <w:color w:val="000000"/>
+        </w:rPr>
+        <w:t xml:space="preserve">para esta solicitud </w:t>
+      </w:r>
+      <w:r>
+        <w:rPr>
+          <w:rFonts w:ascii="Arial" w:eastAsia="Arial" w:hAnsi="Arial" w:cs="Arial"/>
+          <w:color w:val="000000"/>
+        </w:rPr>
+        <w:t>pueden ser operados por medio de variador de velocidad y así permitir flexibilidad de atención en las diferentes etapas del proceso. a) Mezcla, b) neutralización, c) homogeneización</w:t>
       </w:r>
     </w:p>
     <w:p>
@@ -1548,7 +1666,6 @@
           <w:between w:val="nil"/>
         </w:pBdr>
         <w:spacing w:after="0" w:line="240" w:lineRule="auto"/>
-        <w:ind w:left="720"/>
         <w:jc w:val="both"/>
         <w:rPr>
           <w:rFonts w:ascii="Arial" w:eastAsia="Arial" w:hAnsi="Arial" w:cs="Arial"/>
@@ -1581,21 +1698,7 @@
           <w:rFonts w:ascii="Arial" w:eastAsia="Arial" w:hAnsi="Arial" w:cs="Arial"/>
           <w:color w:val="000000"/>
         </w:rPr>
-        <w:t>En cada aplicación se busc</w:t>
-      </w:r>
-      <w:r>
-        <w:rPr>
-          <w:rFonts w:ascii="Arial" w:eastAsia="Arial" w:hAnsi="Arial" w:cs="Arial"/>
-          <w:color w:val="000000"/>
-        </w:rPr>
-        <w:t>ó</w:t>
-      </w:r>
-      <w:r>
-        <w:rPr>
-          <w:rFonts w:ascii="Arial" w:eastAsia="Arial" w:hAnsi="Arial" w:cs="Arial"/>
-          <w:color w:val="000000"/>
-        </w:rPr>
-        <w:t xml:space="preserve"> estandarizar motores y reductores, en potencia y rpm, así como en tipo y diámetro de propelas.</w:t>
+        <w:t>Las propelas del equipo de agitación son desmontables, dando así la opción de desplazarse a lo largo del eje, si así se requiere para ajustes finales de proceso.</w:t>
       </w:r>
     </w:p>
     <w:p>
@@ -1608,7 +1711,7 @@
           <w:between w:val="nil"/>
         </w:pBdr>
         <w:spacing w:after="0" w:line="240" w:lineRule="auto"/>
-        <w:jc w:val="both"/>
+        <w:ind w:left="720"/>
         <w:rPr>
           <w:rFonts w:ascii="Arial" w:eastAsia="Arial" w:hAnsi="Arial" w:cs="Arial"/>
           <w:color w:val="000000"/>
@@ -1640,21 +1743,7 @@
           <w:rFonts w:ascii="Arial" w:eastAsia="Arial" w:hAnsi="Arial" w:cs="Arial"/>
           <w:color w:val="000000"/>
         </w:rPr>
-        <w:t xml:space="preserve">Los agitadores seleccionados por Novatec Fluid System, </w:t>
-      </w:r>
-      <w:r>
-        <w:rPr>
-          <w:rFonts w:ascii="Arial" w:eastAsia="Arial" w:hAnsi="Arial" w:cs="Arial"/>
-          <w:color w:val="000000"/>
-        </w:rPr>
-        <w:t xml:space="preserve">para esta solicitud </w:t>
-      </w:r>
-      <w:r>
-        <w:rPr>
-          <w:rFonts w:ascii="Arial" w:eastAsia="Arial" w:hAnsi="Arial" w:cs="Arial"/>
-          <w:color w:val="000000"/>
-        </w:rPr>
-        <w:t>pueden ser operados por medio de variador de velocidad y así permitir flexibilidad de atención en las diferentes etapas del proceso. a) Mezcla, b) neutralización, c) homogeneización</w:t>
+        <w:t xml:space="preserve"> El material de fabricación de las partes húmedas es acero inoxidable 304SS, según lo requerido. Corresponde al cliente verificar la compatibilidad química entre el material de fabricación ofrecido y los fluidos a mezclar.</w:t>
       </w:r>
     </w:p>
     <w:p>
@@ -1667,6 +1756,7 @@
           <w:between w:val="nil"/>
         </w:pBdr>
         <w:spacing w:after="0" w:line="240" w:lineRule="auto"/>
+        <w:ind w:left="720"/>
         <w:jc w:val="both"/>
         <w:rPr>
           <w:rFonts w:ascii="Arial" w:eastAsia="Arial" w:hAnsi="Arial" w:cs="Arial"/>
@@ -1688,97 +1778,6 @@
           <w:between w:val="nil"/>
         </w:pBdr>
         <w:spacing w:after="0" w:line="240" w:lineRule="auto"/>
-        <w:jc w:val="both"/>
-        <w:rPr>
-          <w:rFonts w:ascii="Arial" w:eastAsia="Arial" w:hAnsi="Arial" w:cs="Arial"/>
-          <w:color w:val="000000"/>
-        </w:rPr>
-      </w:pPr>
-      <w:r>
-        <w:rPr>
-          <w:rFonts w:ascii="Arial" w:eastAsia="Arial" w:hAnsi="Arial" w:cs="Arial"/>
-          <w:color w:val="000000"/>
-        </w:rPr>
-        <w:t>Las propelas del equipo de agitación son desmontables, dando así la opción de desplazarse a lo largo del eje, si así se requiere para ajustes finales de proceso.</w:t>
-      </w:r>
-    </w:p>
-    <w:p>
-      <w:pPr>
-        <w:pBdr>
-          <w:top w:val="nil"/>
-          <w:left w:val="nil"/>
-          <w:bottom w:val="nil"/>
-          <w:right w:val="nil"/>
-          <w:between w:val="nil"/>
-        </w:pBdr>
-        <w:spacing w:after="0" w:line="240" w:lineRule="auto"/>
-        <w:ind w:left="720"/>
-        <w:rPr>
-          <w:rFonts w:ascii="Arial" w:eastAsia="Arial" w:hAnsi="Arial" w:cs="Arial"/>
-          <w:color w:val="000000"/>
-        </w:rPr>
-      </w:pPr>
-    </w:p>
-    <w:p>
-      <w:pPr>
-        <w:numPr>
-          <w:ilvl w:val="0"/>
-          <w:numId w:val="5"/>
-        </w:numPr>
-        <w:pBdr>
-          <w:top w:val="nil"/>
-          <w:left w:val="nil"/>
-          <w:bottom w:val="nil"/>
-          <w:right w:val="nil"/>
-          <w:between w:val="nil"/>
-        </w:pBdr>
-        <w:spacing w:after="0" w:line="240" w:lineRule="auto"/>
-        <w:jc w:val="both"/>
-        <w:rPr>
-          <w:rFonts w:ascii="Arial" w:eastAsia="Arial" w:hAnsi="Arial" w:cs="Arial"/>
-          <w:color w:val="000000"/>
-        </w:rPr>
-      </w:pPr>
-      <w:r>
-        <w:rPr>
-          <w:rFonts w:ascii="Arial" w:eastAsia="Arial" w:hAnsi="Arial" w:cs="Arial"/>
-          <w:color w:val="000000"/>
-        </w:rPr>
-        <w:t xml:space="preserve"> El material de fabricación de las partes húmedas es acero inoxidable 304SS, según lo requerido. Corresponde al cliente verificar la compatibilidad química entre el material de fabricación ofrecido y los fluidos a mezclar.</w:t>
-      </w:r>
-    </w:p>
-    <w:p>
-      <w:pPr>
-        <w:pBdr>
-          <w:top w:val="nil"/>
-          <w:left w:val="nil"/>
-          <w:bottom w:val="nil"/>
-          <w:right w:val="nil"/>
-          <w:between w:val="nil"/>
-        </w:pBdr>
-        <w:spacing w:after="0" w:line="240" w:lineRule="auto"/>
-        <w:ind w:left="720"/>
-        <w:jc w:val="both"/>
-        <w:rPr>
-          <w:rFonts w:ascii="Arial" w:eastAsia="Arial" w:hAnsi="Arial" w:cs="Arial"/>
-          <w:color w:val="000000"/>
-        </w:rPr>
-      </w:pPr>
-    </w:p>
-    <w:p>
-      <w:pPr>
-        <w:numPr>
-          <w:ilvl w:val="0"/>
-          <w:numId w:val="5"/>
-        </w:numPr>
-        <w:pBdr>
-          <w:top w:val="nil"/>
-          <w:left w:val="nil"/>
-          <w:bottom w:val="nil"/>
-          <w:right w:val="nil"/>
-          <w:between w:val="nil"/>
-        </w:pBdr>
-        <w:spacing w:after="0" w:line="240" w:lineRule="auto"/>
         <w:rPr>
           <w:rFonts w:ascii="Arial" w:eastAsia="Arial" w:hAnsi="Arial" w:cs="Arial"/>
           <w:color w:val="000000"/>
@@ -1796,7 +1795,14 @@
           <w:rFonts w:ascii="Arial" w:eastAsia="Arial" w:hAnsi="Arial" w:cs="Arial"/>
           <w:color w:val="000000"/>
         </w:rPr>
-        <w:t>marca NORD</w:t>
+        <w:t xml:space="preserve">marca </w:t>
+      </w:r>
+      <w:r>
+        <w:rPr>
+          <w:rFonts w:ascii="Arial" w:eastAsia="Arial" w:hAnsi="Arial" w:cs="Arial"/>
+          <w:color w:val="000000"/>
+        </w:rPr>
+        <w:t>SEW</w:t>
       </w:r>
       <w:r>
         <w:rPr>
@@ -1855,43 +1861,50 @@
           <w:rFonts w:ascii="Arial" w:eastAsia="Arial" w:hAnsi="Arial" w:cs="Arial"/>
           <w:color w:val="000000"/>
         </w:rPr>
+        <w:t>Los</w:t>
+      </w:r>
+      <w:r>
+        <w:rPr>
+          <w:rFonts w:ascii="Arial" w:eastAsia="Arial" w:hAnsi="Arial" w:cs="Arial"/>
+          <w:color w:val="000000"/>
+        </w:rPr>
+        <w:t xml:space="preserve"> motor</w:t>
+      </w:r>
+      <w:r>
+        <w:rPr>
+          <w:rFonts w:ascii="Arial" w:eastAsia="Arial" w:hAnsi="Arial" w:cs="Arial"/>
+          <w:color w:val="000000"/>
+        </w:rPr>
+        <w:t>es</w:t>
+      </w:r>
+      <w:r>
+        <w:rPr>
+          <w:rFonts w:ascii="Arial" w:eastAsia="Arial" w:hAnsi="Arial" w:cs="Arial"/>
+          <w:color w:val="000000"/>
+        </w:rPr>
+        <w:t xml:space="preserve"> </w:t>
+      </w:r>
+      <w:r>
+        <w:rPr>
+          <w:rFonts w:ascii="Arial" w:eastAsia="Arial" w:hAnsi="Arial" w:cs="Arial"/>
+          <w:color w:val="000000"/>
+        </w:rPr>
+        <w:t>son</w:t>
+      </w:r>
+      <w:r>
+        <w:rPr>
+          <w:rFonts w:ascii="Arial" w:eastAsia="Arial" w:hAnsi="Arial" w:cs="Arial"/>
+          <w:color w:val="000000"/>
+        </w:rPr>
+        <w:t xml:space="preserve"> de eficiencia IE3 y clasificación térmica clase F según norma IEC 600034-1. </w:t>
+      </w:r>
+      <w:r>
+        <w:rPr>
+          <w:rFonts w:ascii="Arial" w:eastAsia="Arial" w:hAnsi="Arial" w:cs="Arial"/>
+          <w:color w:val="000000"/>
+        </w:rPr>
         <w:lastRenderedPageBreak/>
-        <w:t>Los</w:t>
-      </w:r>
-      <w:r>
-        <w:rPr>
-          <w:rFonts w:ascii="Arial" w:eastAsia="Arial" w:hAnsi="Arial" w:cs="Arial"/>
-          <w:color w:val="000000"/>
-        </w:rPr>
-        <w:t xml:space="preserve"> motor</w:t>
-      </w:r>
-      <w:r>
-        <w:rPr>
-          <w:rFonts w:ascii="Arial" w:eastAsia="Arial" w:hAnsi="Arial" w:cs="Arial"/>
-          <w:color w:val="000000"/>
-        </w:rPr>
-        <w:t>es</w:t>
-      </w:r>
-      <w:r>
-        <w:rPr>
-          <w:rFonts w:ascii="Arial" w:eastAsia="Arial" w:hAnsi="Arial" w:cs="Arial"/>
-          <w:color w:val="000000"/>
-        </w:rPr>
-        <w:t xml:space="preserve"> </w:t>
-      </w:r>
-      <w:r>
-        <w:rPr>
-          <w:rFonts w:ascii="Arial" w:eastAsia="Arial" w:hAnsi="Arial" w:cs="Arial"/>
-          <w:color w:val="000000"/>
-        </w:rPr>
-        <w:t>son</w:t>
-      </w:r>
-      <w:r>
-        <w:rPr>
-          <w:rFonts w:ascii="Arial" w:eastAsia="Arial" w:hAnsi="Arial" w:cs="Arial"/>
-          <w:color w:val="000000"/>
-        </w:rPr>
-        <w:t xml:space="preserve"> de eficiencia IE3 y clasificación térmica clase F según norma IEC 600034-1. Encerramiento IP55.</w:t>
+        <w:t>Encerramiento IP55.</w:t>
       </w:r>
     </w:p>
     <w:p>
@@ -2044,6 +2057,16 @@
     <w:p>
       <w:pPr>
         <w:widowControl w:val="0"/>
+        <w:spacing w:after="0" w:line="240" w:lineRule="auto"/>
+        <w:jc w:val="both"/>
+        <w:rPr>
+          <w:rFonts w:ascii="Arial" w:eastAsia="Arial" w:hAnsi="Arial" w:cs="Arial"/>
+        </w:rPr>
+      </w:pPr>
+    </w:p>
+    <w:p>
+      <w:pPr>
+        <w:widowControl w:val="0"/>
         <w:numPr>
           <w:ilvl w:val="0"/>
           <w:numId w:val="4"/>
@@ -2060,6 +2083,25 @@
         </w:rPr>
         <w:t>Plan de control de calidad y pruebas, desarrollado bajo el estándar de Novatec Fluid System, los documentos son generados durante la fabricación de los agitadores.</w:t>
       </w:r>
+    </w:p>
+    <w:p>
+      <w:pPr>
+        <w:pStyle w:val="Prrafodelista"/>
+        <w:rPr>
+          <w:rFonts w:ascii="Arial" w:eastAsia="Arial" w:hAnsi="Arial" w:cs="Arial"/>
+        </w:rPr>
+      </w:pPr>
+    </w:p>
+    <w:p>
+      <w:pPr>
+        <w:widowControl w:val="0"/>
+        <w:spacing w:after="0" w:line="240" w:lineRule="auto"/>
+        <w:ind w:left="720"/>
+        <w:jc w:val="both"/>
+        <w:rPr>
+          <w:rFonts w:ascii="Arial" w:eastAsia="Arial" w:hAnsi="Arial" w:cs="Arial"/>
+        </w:rPr>
+      </w:pPr>
     </w:p>
     <w:p>
       <w:pPr>
@@ -2275,9 +2317,9 @@
           <w:noProof/>
         </w:rPr>
         <w:drawing>
-          <wp:inline distT="0" distB="0" distL="0" distR="0" wp14:anchorId="1DCA63AF" wp14:editId="7944F327">
-            <wp:extent cx="4840837" cy="3149811"/>
-            <wp:effectExtent l="0" t="0" r="0" b="0"/>
+          <wp:inline distT="0" distB="0" distL="0" distR="0" wp14:anchorId="1DCA63AF" wp14:editId="010EE140">
+            <wp:extent cx="4240328" cy="2759075"/>
+            <wp:effectExtent l="0" t="0" r="8255" b="3175"/>
             <wp:docPr id="510992451" name="Imagen 1"/>
             <wp:cNvGraphicFramePr>
               <a:graphicFrameLocks xmlns:a="http://schemas.openxmlformats.org/drawingml/2006/main" noChangeAspect="1"/>
@@ -2307,7 +2349,7 @@
                   <pic:spPr bwMode="auto">
                     <a:xfrm>
                       <a:off x="0" y="0"/>
-                      <a:ext cx="4910554" cy="3195174"/>
+                      <a:ext cx="4304987" cy="2801147"/>
                     </a:xfrm>
                     <a:prstGeom prst="rect">
                       <a:avLst/>
@@ -3318,34 +3360,27 @@
                 <w:sz w:val="16"/>
                 <w:szCs w:val="16"/>
               </w:rPr>
-              <w:t>Cuatro</w:t>
-            </w:r>
-            <w:r>
-              <w:rPr>
-                <w:rFonts w:ascii="Arial" w:eastAsia="Arial" w:hAnsi="Arial" w:cs="Arial"/>
-                <w:color w:val="000000"/>
-                <w:sz w:val="16"/>
-                <w:szCs w:val="16"/>
-              </w:rPr>
-              <w:t xml:space="preserve"> (</w:t>
-            </w:r>
-            <w:r>
-              <w:rPr>
-                <w:rFonts w:ascii="Arial" w:eastAsia="Arial" w:hAnsi="Arial" w:cs="Arial"/>
-                <w:color w:val="000000"/>
-                <w:sz w:val="16"/>
-                <w:szCs w:val="16"/>
-              </w:rPr>
-              <w:t>4</w:t>
-            </w:r>
-            <w:r>
-              <w:rPr>
-                <w:rFonts w:ascii="Arial" w:eastAsia="Arial" w:hAnsi="Arial" w:cs="Arial"/>
-                <w:color w:val="000000"/>
-                <w:sz w:val="16"/>
-                <w:szCs w:val="16"/>
-              </w:rPr>
-              <w:t>) Propela Curva tripala, Diámetro (D): 00 mm</w:t>
+              <w:t>Propela 1: ${propela1_tipo</w:t>
+            </w:r>
+            <w:proofErr w:type="gramStart"/>
+            <w:r>
+              <w:rPr>
+                <w:rFonts w:ascii="Arial" w:eastAsia="Arial" w:hAnsi="Arial" w:cs="Arial"/>
+                <w:color w:val="000000"/>
+                <w:sz w:val="16"/>
+                <w:szCs w:val="16"/>
+              </w:rPr>
+              <w:t>} ,</w:t>
+            </w:r>
+            <w:proofErr w:type="gramEnd"/>
+            <w:r>
+              <w:rPr>
+                <w:rFonts w:ascii="Arial" w:eastAsia="Arial" w:hAnsi="Arial" w:cs="Arial"/>
+                <w:color w:val="000000"/>
+                <w:sz w:val="16"/>
+                <w:szCs w:val="16"/>
+              </w:rPr>
+              <w:t xml:space="preserve"> ${propela1_diametro} mm</w:t>
             </w:r>
           </w:p>
           <w:p>
@@ -3366,45 +3401,27 @@
                 <w:sz w:val="16"/>
                 <w:szCs w:val="16"/>
               </w:rPr>
-              <w:t xml:space="preserve">Longitud del eje (H) </w:t>
-            </w:r>
-            <w:proofErr w:type="spellStart"/>
-            <w:r>
-              <w:rPr>
-                <w:rFonts w:ascii="Arial" w:eastAsia="Arial" w:hAnsi="Arial" w:cs="Arial"/>
-                <w:color w:val="000000"/>
-                <w:sz w:val="16"/>
-                <w:szCs w:val="16"/>
-              </w:rPr>
-              <w:t>aprox</w:t>
-            </w:r>
-            <w:proofErr w:type="spellEnd"/>
-            <w:r>
-              <w:rPr>
-                <w:rFonts w:ascii="Arial" w:eastAsia="Arial" w:hAnsi="Arial" w:cs="Arial"/>
-                <w:color w:val="000000"/>
-                <w:sz w:val="16"/>
-                <w:szCs w:val="16"/>
-              </w:rPr>
-              <w:t xml:space="preserve">: </w:t>
-            </w:r>
-            <w:r>
-              <w:rPr>
-                <w:rFonts w:ascii="Arial" w:eastAsia="Arial" w:hAnsi="Arial" w:cs="Arial"/>
-                <w:color w:val="000000"/>
-                <w:sz w:val="16"/>
-                <w:szCs w:val="16"/>
-              </w:rPr>
-              <w:t>4</w:t>
-            </w:r>
-            <w:r>
-              <w:rPr>
-                <w:rFonts w:ascii="Arial" w:eastAsia="Arial" w:hAnsi="Arial" w:cs="Arial"/>
-                <w:color w:val="000000"/>
-                <w:sz w:val="16"/>
-                <w:szCs w:val="16"/>
-              </w:rPr>
-              <w:t>00 mm</w:t>
+              <w:t>Propela 2: ${propela2_tipo</w:t>
+            </w:r>
+            <w:proofErr w:type="gramStart"/>
+            <w:r>
+              <w:rPr>
+                <w:rFonts w:ascii="Arial" w:eastAsia="Arial" w:hAnsi="Arial" w:cs="Arial"/>
+                <w:color w:val="000000"/>
+                <w:sz w:val="16"/>
+                <w:szCs w:val="16"/>
+              </w:rPr>
+              <w:t>} ,</w:t>
+            </w:r>
+            <w:proofErr w:type="gramEnd"/>
+            <w:r>
+              <w:rPr>
+                <w:rFonts w:ascii="Arial" w:eastAsia="Arial" w:hAnsi="Arial" w:cs="Arial"/>
+                <w:color w:val="000000"/>
+                <w:sz w:val="16"/>
+                <w:szCs w:val="16"/>
+              </w:rPr>
+              <w:t xml:space="preserve"> ${propela2_diametro} mm</w:t>
             </w:r>
           </w:p>
           <w:p>
@@ -3425,34 +3442,139 @@
                 <w:sz w:val="16"/>
                 <w:szCs w:val="16"/>
               </w:rPr>
-              <w:t>Tipo</w:t>
-            </w:r>
-            <w:r>
-              <w:rPr>
-                <w:rFonts w:ascii="Arial" w:eastAsia="Arial" w:hAnsi="Arial" w:cs="Arial"/>
-                <w:color w:val="000000"/>
-                <w:sz w:val="16"/>
-                <w:szCs w:val="16"/>
-              </w:rPr>
-              <w:t xml:space="preserve"> de eje (De):  </w:t>
-            </w:r>
-            <w:r>
-              <w:rPr>
-                <w:rFonts w:ascii="Arial" w:eastAsia="Arial" w:hAnsi="Arial" w:cs="Arial"/>
-                <w:color w:val="000000"/>
-                <w:sz w:val="16"/>
-                <w:szCs w:val="16"/>
-              </w:rPr>
-              <w:t>Tubular</w:t>
-            </w:r>
-            <w:r>
-              <w:rPr>
-                <w:rFonts w:ascii="Arial" w:eastAsia="Arial" w:hAnsi="Arial" w:cs="Arial"/>
-                <w:color w:val="000000"/>
-                <w:sz w:val="16"/>
-                <w:szCs w:val="16"/>
-              </w:rPr>
-              <w:t xml:space="preserve">, </w:t>
+              <w:t>Propela 3: ${propela3_tipo</w:t>
+            </w:r>
+            <w:proofErr w:type="gramStart"/>
+            <w:r>
+              <w:rPr>
+                <w:rFonts w:ascii="Arial" w:eastAsia="Arial" w:hAnsi="Arial" w:cs="Arial"/>
+                <w:color w:val="000000"/>
+                <w:sz w:val="16"/>
+                <w:szCs w:val="16"/>
+              </w:rPr>
+              <w:t>} ,</w:t>
+            </w:r>
+            <w:proofErr w:type="gramEnd"/>
+            <w:r>
+              <w:rPr>
+                <w:rFonts w:ascii="Arial" w:eastAsia="Arial" w:hAnsi="Arial" w:cs="Arial"/>
+                <w:color w:val="000000"/>
+                <w:sz w:val="16"/>
+                <w:szCs w:val="16"/>
+              </w:rPr>
+              <w:t xml:space="preserve"> ${propela3_diametro} mm</w:t>
+            </w:r>
+          </w:p>
+          <w:p>
+            <w:pPr>
+              <w:spacing w:after="0"/>
+              <w:jc w:val="both"/>
+              <w:rPr>
+                <w:rFonts w:ascii="Arial" w:eastAsia="Arial" w:hAnsi="Arial" w:cs="Arial"/>
+                <w:color w:val="000000"/>
+                <w:sz w:val="16"/>
+                <w:szCs w:val="16"/>
+              </w:rPr>
+            </w:pPr>
+            <w:r>
+              <w:rPr>
+                <w:rFonts w:ascii="Arial" w:eastAsia="Arial" w:hAnsi="Arial" w:cs="Arial"/>
+                <w:color w:val="000000"/>
+                <w:sz w:val="16"/>
+                <w:szCs w:val="16"/>
+              </w:rPr>
+              <w:t>Propela 4: ${propela4_tipo</w:t>
+            </w:r>
+            <w:proofErr w:type="gramStart"/>
+            <w:r>
+              <w:rPr>
+                <w:rFonts w:ascii="Arial" w:eastAsia="Arial" w:hAnsi="Arial" w:cs="Arial"/>
+                <w:color w:val="000000"/>
+                <w:sz w:val="16"/>
+                <w:szCs w:val="16"/>
+              </w:rPr>
+              <w:t>} ,</w:t>
+            </w:r>
+            <w:proofErr w:type="gramEnd"/>
+            <w:r>
+              <w:rPr>
+                <w:rFonts w:ascii="Arial" w:eastAsia="Arial" w:hAnsi="Arial" w:cs="Arial"/>
+                <w:color w:val="000000"/>
+                <w:sz w:val="16"/>
+                <w:szCs w:val="16"/>
+              </w:rPr>
+              <w:t xml:space="preserve"> ${propela4_diametro} mm</w:t>
+            </w:r>
+          </w:p>
+          <w:p>
+            <w:pPr>
+              <w:spacing w:after="0"/>
+              <w:jc w:val="both"/>
+              <w:rPr>
+                <w:rFonts w:ascii="Arial" w:eastAsia="Arial" w:hAnsi="Arial" w:cs="Arial"/>
+                <w:color w:val="000000"/>
+                <w:sz w:val="16"/>
+                <w:szCs w:val="16"/>
+              </w:rPr>
+            </w:pPr>
+          </w:p>
+          <w:p>
+            <w:pPr>
+              <w:spacing w:after="0"/>
+              <w:jc w:val="both"/>
+              <w:rPr>
+                <w:rFonts w:ascii="Arial" w:eastAsia="Arial" w:hAnsi="Arial" w:cs="Arial"/>
+                <w:color w:val="000000"/>
+                <w:sz w:val="16"/>
+                <w:szCs w:val="16"/>
+              </w:rPr>
+            </w:pPr>
+            <w:r>
+              <w:rPr>
+                <w:rFonts w:ascii="Arial" w:eastAsia="Arial" w:hAnsi="Arial" w:cs="Arial"/>
+                <w:color w:val="000000"/>
+                <w:sz w:val="16"/>
+                <w:szCs w:val="16"/>
+              </w:rPr>
+              <w:t xml:space="preserve">Longitud del eje (H) </w:t>
+            </w:r>
+            <w:r>
+              <w:rPr>
+                <w:rFonts w:ascii="Arial" w:eastAsia="Arial" w:hAnsi="Arial" w:cs="Arial"/>
+                <w:color w:val="000000"/>
+                <w:sz w:val="16"/>
+                <w:szCs w:val="16"/>
+              </w:rPr>
+              <w:t>${</w:t>
+            </w:r>
+            <w:proofErr w:type="spellStart"/>
+            <w:r>
+              <w:rPr>
+                <w:rFonts w:ascii="Arial" w:eastAsia="Arial" w:hAnsi="Arial" w:cs="Arial"/>
+                <w:color w:val="000000"/>
+                <w:sz w:val="16"/>
+                <w:szCs w:val="16"/>
+              </w:rPr>
+              <w:t>longitud_eje</w:t>
+            </w:r>
+            <w:proofErr w:type="spellEnd"/>
+            <w:r>
+              <w:rPr>
+                <w:rFonts w:ascii="Arial" w:eastAsia="Arial" w:hAnsi="Arial" w:cs="Arial"/>
+                <w:color w:val="000000"/>
+                <w:sz w:val="16"/>
+                <w:szCs w:val="16"/>
+              </w:rPr>
+              <w:t>}</w:t>
+            </w:r>
+            <w:r>
+              <w:rPr>
+                <w:rFonts w:ascii="Arial" w:eastAsia="Arial" w:hAnsi="Arial" w:cs="Arial"/>
+                <w:color w:val="000000"/>
+                <w:sz w:val="16"/>
+                <w:szCs w:val="16"/>
+              </w:rPr>
+              <w:t xml:space="preserve"> mm</w:t>
             </w:r>
           </w:p>
           <w:p>
@@ -4465,7 +4587,6 @@
           <w:szCs w:val="24"/>
           <w:u w:val="single"/>
         </w:rPr>
-        <w:lastRenderedPageBreak/>
         <w:t>Términos y Condiciones</w:t>
       </w:r>
     </w:p>
@@ -5622,6 +5743,7 @@
           <w:rFonts w:ascii="Arial" w:eastAsia="Arial" w:hAnsi="Arial" w:cs="Arial"/>
           <w:color w:val="000000"/>
         </w:rPr>
+        <w:lastRenderedPageBreak/>
         <w:t xml:space="preserve">Cali, Colombia                            </w:t>
       </w:r>
       <w:r>

</xml_diff>